<commit_message>
Accept LibreOffice (.odt) files; add LibreOffice notes to template and README
Co-Authored-By: Claude Sonnet 5.5 <noreply@anthropic.com>
Claude-Session: https://claude.ai/code/session_01AFttd4ZhKzSUEiUAhU2CQq
</commit_message>
<xml_diff>
--- a/templates/The-Truth_Writer-Template.docx
+++ b/templates/The-Truth_Writer-Template.docx
@@ -54,6 +54,14 @@
       </w:pPr>
       <w:r>
         <w:t>4. Save the file and upload it to the Truth website's submissions folder. The page appears on the site in about five minutes. To change a page later, edit your file and upload it again with the same file name.</w:t>
+      </w:r>
+    </w:p>
+    <w:p>
+      <w:pPr>
+        <w:pStyle w:val="WriterNote"/>
+      </w:pPr>
+      <w:r>
+        <w:t>Using LibreOffice? This template works there too. Save with File &gt; Save As and keep the type Word 2007-365 (.docx), or save as the default .odt. Either file can be uploaded.</w:t>
       </w:r>
     </w:p>
     <w:p>

</xml_diff>